<commit_message>
Phase 3: update master documentation
</commit_message>
<xml_diff>
--- a/00_PROJECT_DOCUMENTATION/Phase 3/NOVYRA_OS_Phase_3_Master_Documentation.docx
+++ b/00_PROJECT_DOCUMENTATION/Phase 3/NOVYRA_OS_Phase_3_Master_Documentation.docx
@@ -4,84 +4,95 @@
   <w:body>
     <w:p>
       <w:pPr>
-        <w:jc w:val="center"/>
+        <w:pStyle w:val="Heading1"/>
       </w:pPr>
       <w:r>
-        <w:rPr>
-          <w:b/>
-          <w:sz w:val="56"/>
-        </w:rPr>
         <w:t>NOVYRA OS</w:t>
       </w:r>
     </w:p>
     <w:p>
       <w:pPr>
-        <w:jc w:val="center"/>
+        <w:pStyle w:val="Heading2"/>
       </w:pPr>
       <w:r>
-        <w:rPr>
-          <w:b/>
-          <w:sz w:val="36"/>
-        </w:rPr>
-        <w:t>PHASE 3 MASTER DOCUMENTATION</w:t>
+        <w:t>Phase 3 Master Documentation</w:t>
+      </w:r>
+    </w:p>
+    <w:p>
+      <w:r>
+        <w:t>Domain Model and Service Layer Foundation</w:t>
+      </w:r>
+    </w:p>
+    <w:p>
+      <w:r>
+        <w:t>Status: Updated after Opportunity domain model and service implementation</w:t>
+      </w:r>
+    </w:p>
+    <w:p>
+      <w:r>
+        <w:t>Repository: NOVYRA_OS | Branch: main</w:t>
       </w:r>
     </w:p>
     <w:p>
       <w:pPr>
-        <w:jc w:val="center"/>
+        <w:pStyle w:val="Heading2"/>
       </w:pPr>
       <w:r>
-        <w:rPr>
-          <w:i/>
-          <w:sz w:val="26"/>
-        </w:rPr>
-        <w:t>Core Domain Model Foundation</w:t>
+        <w:t>1. Phase 3 Objective</w:t>
       </w:r>
     </w:p>
-    <w:p/>
+    <w:p>
+      <w:r>
+        <w:t>Phase 3 extends the Phase 2 application skeleton into the first domain-driven application layer. It establishes reusable domain-model conventions, introduces the Opportunity business entity, and adds a service layer that validates and creates Opportunity instances through the standardized ServiceResult contract.</w:t>
+      </w:r>
+    </w:p>
+    <w:p>
+      <w:pPr>
+        <w:pStyle w:val="Heading2"/>
+      </w:pPr>
+      <w:r>
+        <w:t>2. Completed Phase 3 Components</w:t>
+      </w:r>
+    </w:p>
     <w:tbl>
       <w:tblPr>
         <w:tblStyle w:val="TableGrid"/>
         <w:tblW w:type="auto" w:w="0"/>
-        <w:jc w:val="center"/>
         <w:tblLook w:firstColumn="1" w:firstRow="1" w:lastColumn="0" w:lastRow="0" w:noHBand="0" w:noVBand="1" w:val="04A0"/>
       </w:tblPr>
       <w:tblGrid>
-        <w:gridCol w:w="4968"/>
-        <w:gridCol w:w="4968"/>
+        <w:gridCol w:w="2880"/>
+        <w:gridCol w:w="2880"/>
+        <w:gridCol w:w="2880"/>
       </w:tblGrid>
       <w:tr>
         <w:tc>
           <w:tcPr>
-            <w:tcW w:type="dxa" w:w="4968"/>
-            <w:vAlign w:val="center"/>
-            <w:shd w:fill="D9EAF7"/>
+            <w:tcW w:type="dxa" w:w="2880"/>
           </w:tcPr>
           <w:p>
             <w:r>
-              <w:rPr>
-                <w:rFonts w:ascii="Aptos" w:hAnsi="Aptos"/>
-                <w:b/>
-                <w:sz w:val="18"/>
-              </w:rPr>
-              <w:t>Document Property</w:t>
+              <w:t>Area</w:t>
             </w:r>
           </w:p>
         </w:tc>
         <w:tc>
           <w:tcPr>
-            <w:tcW w:type="dxa" w:w="4968"/>
-            <w:vAlign w:val="center"/>
-            <w:shd w:fill="D9EAF7"/>
+            <w:tcW w:type="dxa" w:w="2880"/>
           </w:tcPr>
           <w:p>
             <w:r>
-              <w:rPr>
-                <w:rFonts w:ascii="Aptos" w:hAnsi="Aptos"/>
-                <w:b/>
-                <w:sz w:val="18"/>
-              </w:rPr>
-              <w:t>Value</w:t>
+              <w:t>Status</w:t>
+            </w:r>
+          </w:p>
+        </w:tc>
+        <w:tc>
+          <w:tcPr>
+            <w:tcW w:type="dxa" w:w="2880"/>
+          </w:tcPr>
+          <w:p>
+            <w:r>
+              <w:t>Implementation</w:t>
             </w:r>
           </w:p>
         </w:tc>
@@ -89,31 +100,31 @@
       <w:tr>
         <w:tc>
           <w:tcPr>
-            <w:tcW w:type="dxa" w:w="4968"/>
-            <w:vAlign w:val="center"/>
+            <w:tcW w:type="dxa" w:w="2880"/>
           </w:tcPr>
           <w:p>
             <w:r>
-              <w:rPr>
-                <w:rFonts w:ascii="Aptos" w:hAnsi="Aptos"/>
-                <w:sz w:val="18"/>
-              </w:rPr>
-              <w:t>Project</w:t>
+              <w:t>Shared model helpers</w:t>
             </w:r>
           </w:p>
         </w:tc>
         <w:tc>
           <w:tcPr>
-            <w:tcW w:type="dxa" w:w="4968"/>
-            <w:vAlign w:val="center"/>
+            <w:tcW w:type="dxa" w:w="2880"/>
           </w:tcPr>
           <w:p>
             <w:r>
-              <w:rPr>
-                <w:rFonts w:ascii="Aptos" w:hAnsi="Aptos"/>
-                <w:sz w:val="18"/>
-              </w:rPr>
-              <w:t>NOVYRA OS</w:t>
+              <w:t>Complete</w:t>
+            </w:r>
+          </w:p>
+        </w:tc>
+        <w:tc>
+          <w:tcPr>
+            <w:tcW w:type="dxa" w:w="2880"/>
+          </w:tcPr>
+          <w:p>
+            <w:r>
+              <w:t>app/models/base.py</w:t>
             </w:r>
           </w:p>
         </w:tc>
@@ -121,31 +132,31 @@
       <w:tr>
         <w:tc>
           <w:tcPr>
-            <w:tcW w:type="dxa" w:w="4968"/>
-            <w:vAlign w:val="center"/>
+            <w:tcW w:type="dxa" w:w="2880"/>
           </w:tcPr>
           <w:p>
             <w:r>
-              <w:rPr>
-                <w:rFonts w:ascii="Aptos" w:hAnsi="Aptos"/>
-                <w:sz w:val="18"/>
-              </w:rPr>
-              <w:t>Phase</w:t>
+              <w:t>Opportunity domain model</w:t>
             </w:r>
           </w:p>
         </w:tc>
         <w:tc>
           <w:tcPr>
-            <w:tcW w:type="dxa" w:w="4968"/>
-            <w:vAlign w:val="center"/>
+            <w:tcW w:type="dxa" w:w="2880"/>
           </w:tcPr>
           <w:p>
             <w:r>
-              <w:rPr>
-                <w:rFonts w:ascii="Aptos" w:hAnsi="Aptos"/>
-                <w:sz w:val="18"/>
-              </w:rPr>
-              <w:t>Phase 3 — Core Domain Model Foundation</w:t>
+              <w:t>Complete</w:t>
+            </w:r>
+          </w:p>
+        </w:tc>
+        <w:tc>
+          <w:tcPr>
+            <w:tcW w:type="dxa" w:w="2880"/>
+          </w:tcPr>
+          <w:p>
+            <w:r>
+              <w:t>app/models/opportunity.py</w:t>
             </w:r>
           </w:p>
         </w:tc>
@@ -153,31 +164,31 @@
       <w:tr>
         <w:tc>
           <w:tcPr>
-            <w:tcW w:type="dxa" w:w="4968"/>
-            <w:vAlign w:val="center"/>
+            <w:tcW w:type="dxa" w:w="2880"/>
           </w:tcPr>
           <w:p>
             <w:r>
-              <w:rPr>
-                <w:rFonts w:ascii="Aptos" w:hAnsi="Aptos"/>
-                <w:sz w:val="18"/>
-              </w:rPr>
-              <w:t>Version</w:t>
+              <w:t>Model package exports</w:t>
             </w:r>
           </w:p>
         </w:tc>
         <w:tc>
           <w:tcPr>
-            <w:tcW w:type="dxa" w:w="4968"/>
-            <w:vAlign w:val="center"/>
+            <w:tcW w:type="dxa" w:w="2880"/>
           </w:tcPr>
           <w:p>
             <w:r>
-              <w:rPr>
-                <w:rFonts w:ascii="Aptos" w:hAnsi="Aptos"/>
-                <w:sz w:val="18"/>
-              </w:rPr>
-              <w:t>1.0</w:t>
+              <w:t>Complete</w:t>
+            </w:r>
+          </w:p>
+        </w:tc>
+        <w:tc>
+          <w:tcPr>
+            <w:tcW w:type="dxa" w:w="2880"/>
+          </w:tcPr>
+          <w:p>
+            <w:r>
+              <w:t>app/models/__init__.py</w:t>
             </w:r>
           </w:p>
         </w:tc>
@@ -185,31 +196,31 @@
       <w:tr>
         <w:tc>
           <w:tcPr>
-            <w:tcW w:type="dxa" w:w="4968"/>
-            <w:vAlign w:val="center"/>
+            <w:tcW w:type="dxa" w:w="2880"/>
           </w:tcPr>
           <w:p>
             <w:r>
-              <w:rPr>
-                <w:rFonts w:ascii="Aptos" w:hAnsi="Aptos"/>
-                <w:sz w:val="18"/>
-              </w:rPr>
-              <w:t>Status</w:t>
+              <w:t>Opportunity service layer</w:t>
             </w:r>
           </w:p>
         </w:tc>
         <w:tc>
           <w:tcPr>
-            <w:tcW w:type="dxa" w:w="4968"/>
-            <w:vAlign w:val="center"/>
+            <w:tcW w:type="dxa" w:w="2880"/>
           </w:tcPr>
           <w:p>
             <w:r>
-              <w:rPr>
-                <w:rFonts w:ascii="Aptos" w:hAnsi="Aptos"/>
-                <w:sz w:val="18"/>
-              </w:rPr>
-              <w:t>Planning baseline</w:t>
+              <w:t>Complete</w:t>
+            </w:r>
+          </w:p>
+        </w:tc>
+        <w:tc>
+          <w:tcPr>
+            <w:tcW w:type="dxa" w:w="2880"/>
+          </w:tcPr>
+          <w:p>
+            <w:r>
+              <w:t>app/services/opportunity_service.py</w:t>
             </w:r>
           </w:p>
         </w:tc>
@@ -217,31 +228,31 @@
       <w:tr>
         <w:tc>
           <w:tcPr>
-            <w:tcW w:type="dxa" w:w="4968"/>
-            <w:vAlign w:val="center"/>
+            <w:tcW w:type="dxa" w:w="2880"/>
           </w:tcPr>
           <w:p>
             <w:r>
-              <w:rPr>
-                <w:rFonts w:ascii="Aptos" w:hAnsi="Aptos"/>
-                <w:sz w:val="18"/>
-              </w:rPr>
-              <w:t>Primary Repository</w:t>
+              <w:t>Service package exports</w:t>
             </w:r>
           </w:p>
         </w:tc>
         <w:tc>
           <w:tcPr>
-            <w:tcW w:type="dxa" w:w="4968"/>
-            <w:vAlign w:val="center"/>
+            <w:tcW w:type="dxa" w:w="2880"/>
           </w:tcPr>
           <w:p>
             <w:r>
-              <w:rPr>
-                <w:rFonts w:ascii="Aptos" w:hAnsi="Aptos"/>
-                <w:sz w:val="18"/>
-              </w:rPr>
-              <w:t>NOVYRA_OS</w:t>
+              <w:t>Complete</w:t>
+            </w:r>
+          </w:p>
+        </w:tc>
+        <w:tc>
+          <w:tcPr>
+            <w:tcW w:type="dxa" w:w="2880"/>
+          </w:tcPr>
+          <w:p>
+            <w:r>
+              <w:t>app/services/__init__.py</w:t>
             </w:r>
           </w:p>
         </w:tc>
@@ -249,31 +260,31 @@
       <w:tr>
         <w:tc>
           <w:tcPr>
-            <w:tcW w:type="dxa" w:w="4968"/>
-            <w:vAlign w:val="center"/>
+            <w:tcW w:type="dxa" w:w="2880"/>
           </w:tcPr>
           <w:p>
             <w:r>
-              <w:rPr>
-                <w:rFonts w:ascii="Aptos" w:hAnsi="Aptos"/>
-                <w:sz w:val="18"/>
-              </w:rPr>
-              <w:t>Purpose</w:t>
+              <w:t>Automated tests</w:t>
             </w:r>
           </w:p>
         </w:tc>
         <w:tc>
           <w:tcPr>
-            <w:tcW w:type="dxa" w:w="4968"/>
-            <w:vAlign w:val="center"/>
+            <w:tcW w:type="dxa" w:w="2880"/>
           </w:tcPr>
           <w:p>
             <w:r>
-              <w:rPr>
-                <w:rFonts w:ascii="Aptos" w:hAnsi="Aptos"/>
-                <w:sz w:val="18"/>
-              </w:rPr>
-              <w:t>Define the next domain-model phase after the verified Phase 2 foundation</w:t>
+              <w:t>Complete</w:t>
+            </w:r>
+          </w:p>
+        </w:tc>
+        <w:tc>
+          <w:tcPr>
+            <w:tcW w:type="dxa" w:w="2880"/>
+          </w:tcPr>
+          <w:p>
+            <w:r>
+              <w:t>Model and service coverage</w:t>
             </w:r>
           </w:p>
         </w:tc>
@@ -281,31 +292,31 @@
       <w:tr>
         <w:tc>
           <w:tcPr>
-            <w:tcW w:type="dxa" w:w="4968"/>
-            <w:vAlign w:val="center"/>
+            <w:tcW w:type="dxa" w:w="2880"/>
           </w:tcPr>
           <w:p>
             <w:r>
-              <w:rPr>
-                <w:rFonts w:ascii="Aptos" w:hAnsi="Aptos"/>
-                <w:sz w:val="18"/>
-              </w:rPr>
-              <w:t>Documentation Rule</w:t>
+              <w:t>Phase 3 documentation</w:t>
             </w:r>
           </w:p>
         </w:tc>
         <w:tc>
           <w:tcPr>
-            <w:tcW w:type="dxa" w:w="4968"/>
-            <w:vAlign w:val="center"/>
+            <w:tcW w:type="dxa" w:w="2880"/>
           </w:tcPr>
           <w:p>
             <w:r>
-              <w:rPr>
-                <w:rFonts w:ascii="Aptos" w:hAnsi="Aptos"/>
-                <w:sz w:val="18"/>
-              </w:rPr>
-              <w:t>One master document per phase</w:t>
+              <w:t>Updated</w:t>
+            </w:r>
+          </w:p>
+        </w:tc>
+        <w:tc>
+          <w:tcPr>
+            <w:tcW w:type="dxa" w:w="2880"/>
+          </w:tcPr>
+          <w:p>
+            <w:r>
+              <w:t>This master document</w:t>
             </w:r>
           </w:p>
         </w:tc>
@@ -313,347 +324,28 @@
     </w:tbl>
     <w:p>
       <w:pPr>
-        <w:jc w:val="center"/>
+        <w:pStyle w:val="Heading2"/>
       </w:pPr>
       <w:r>
-        <w:rPr>
-          <w:i/>
-          <w:sz w:val="18"/>
-        </w:rPr>
-        <w:t>Prepared as the official planning baseline for Phase 3.</w:t>
+        <w:t>3. Domain Model Foundation</w:t>
       </w:r>
     </w:p>
     <w:p>
       <w:r>
-        <w:br w:type="page"/>
+        <w:t>The Phase 3 model layer introduces shared validation and normalization helpers. require_non_empty() validates required text, strips surrounding whitespace, and rejects empty values. normalize_optional_text() safely normalizes optional text fields while allowing None.</w:t>
       </w:r>
     </w:p>
     <w:p>
       <w:pPr>
-        <w:pStyle w:val="Heading1"/>
+        <w:pStyle w:val="Heading2"/>
       </w:pPr>
       <w:r>
-        <w:t>Document Control</w:t>
+        <w:t>4. Opportunity Domain Model</w:t>
       </w:r>
     </w:p>
     <w:p>
       <w:r>
-        <w:t>This document is the standalone master record for Phase 3 of NOVYRA OS. It defines the planned purpose, scope, architecture direction, implementation sequence, testing strategy, risks, and completion criteria for the next phase.</w:t>
-      </w:r>
-    </w:p>
-    <w:tbl>
-      <w:tblPr>
-        <w:tblStyle w:val="TableGrid"/>
-        <w:tblW w:type="auto" w:w="0"/>
-        <w:jc w:val="center"/>
-        <w:tblLook w:firstColumn="1" w:firstRow="1" w:lastColumn="0" w:lastRow="0" w:noHBand="0" w:noVBand="1" w:val="04A0"/>
-      </w:tblPr>
-      <w:tblGrid>
-        <w:gridCol w:w="3312"/>
-        <w:gridCol w:w="3312"/>
-        <w:gridCol w:w="3312"/>
-      </w:tblGrid>
-      <w:tr>
-        <w:tc>
-          <w:tcPr>
-            <w:tcW w:type="dxa" w:w="3312"/>
-            <w:vAlign w:val="center"/>
-            <w:shd w:fill="FCE4D6"/>
-          </w:tcPr>
-          <w:p>
-            <w:r>
-              <w:rPr>
-                <w:rFonts w:ascii="Aptos" w:hAnsi="Aptos"/>
-                <w:b/>
-                <w:sz w:val="18"/>
-              </w:rPr>
-              <w:t>Revision</w:t>
-            </w:r>
-          </w:p>
-        </w:tc>
-        <w:tc>
-          <w:tcPr>
-            <w:tcW w:type="dxa" w:w="3312"/>
-            <w:vAlign w:val="center"/>
-            <w:shd w:fill="FCE4D6"/>
-          </w:tcPr>
-          <w:p>
-            <w:r>
-              <w:rPr>
-                <w:rFonts w:ascii="Aptos" w:hAnsi="Aptos"/>
-                <w:b/>
-                <w:sz w:val="18"/>
-              </w:rPr>
-              <w:t>Status</w:t>
-            </w:r>
-          </w:p>
-        </w:tc>
-        <w:tc>
-          <w:tcPr>
-            <w:tcW w:type="dxa" w:w="3312"/>
-            <w:vAlign w:val="center"/>
-            <w:shd w:fill="FCE4D6"/>
-          </w:tcPr>
-          <w:p>
-            <w:r>
-              <w:rPr>
-                <w:rFonts w:ascii="Aptos" w:hAnsi="Aptos"/>
-                <w:b/>
-                <w:sz w:val="18"/>
-              </w:rPr>
-              <w:t>Description</w:t>
-            </w:r>
-          </w:p>
-        </w:tc>
-      </w:tr>
-      <w:tr>
-        <w:tc>
-          <w:tcPr>
-            <w:tcW w:type="dxa" w:w="3312"/>
-            <w:vAlign w:val="center"/>
-          </w:tcPr>
-          <w:p>
-            <w:r>
-              <w:rPr>
-                <w:rFonts w:ascii="Aptos" w:hAnsi="Aptos"/>
-                <w:sz w:val="18"/>
-              </w:rPr>
-              <w:t>1.0</w:t>
-            </w:r>
-          </w:p>
-        </w:tc>
-        <w:tc>
-          <w:tcPr>
-            <w:tcW w:type="dxa" w:w="3312"/>
-            <w:vAlign w:val="center"/>
-          </w:tcPr>
-          <w:p>
-            <w:r>
-              <w:rPr>
-                <w:rFonts w:ascii="Aptos" w:hAnsi="Aptos"/>
-                <w:sz w:val="18"/>
-              </w:rPr>
-              <w:t>Initial planning baseline</w:t>
-            </w:r>
-          </w:p>
-        </w:tc>
-        <w:tc>
-          <w:tcPr>
-            <w:tcW w:type="dxa" w:w="3312"/>
-            <w:vAlign w:val="center"/>
-          </w:tcPr>
-          <w:p>
-            <w:r>
-              <w:rPr>
-                <w:rFonts w:ascii="Aptos" w:hAnsi="Aptos"/>
-                <w:sz w:val="18"/>
-              </w:rPr>
-              <w:t>Phase 3 master documentation created before implementation begins.</w:t>
-            </w:r>
-          </w:p>
-        </w:tc>
-      </w:tr>
-    </w:tbl>
-    <w:p>
-      <w:pPr>
-        <w:pStyle w:val="Heading1"/>
-      </w:pPr>
-      <w:r>
-        <w:t>1. Phase 2 Exit State</w:t>
-      </w:r>
-    </w:p>
-    <w:p>
-      <w:r>
-        <w:t>Phase 3 begins only after Phase 2 has been verified and closed. The latest Phase 2 checkpoint recorded 23 passing tests, a successful application run, and a clean Git working tree.</w:t>
-      </w:r>
-    </w:p>
-    <w:tbl>
-      <w:tblPr>
-        <w:tblStyle w:val="TableGrid"/>
-        <w:tblW w:type="auto" w:w="0"/>
-        <w:jc w:val="center"/>
-        <w:tblLook w:firstColumn="1" w:firstRow="1" w:lastColumn="0" w:lastRow="0" w:noHBand="0" w:noVBand="1" w:val="04A0"/>
-      </w:tblPr>
-      <w:tblGrid>
-        <w:gridCol w:w="4968"/>
-        <w:gridCol w:w="4968"/>
-      </w:tblGrid>
-      <w:tr>
-        <w:tc>
-          <w:tcPr>
-            <w:tcW w:type="dxa" w:w="4968"/>
-            <w:vAlign w:val="center"/>
-            <w:shd w:fill="E2F0D9"/>
-          </w:tcPr>
-          <w:p>
-            <w:r>
-              <w:rPr>
-                <w:rFonts w:ascii="Aptos" w:hAnsi="Aptos"/>
-                <w:b/>
-                <w:sz w:val="18"/>
-              </w:rPr>
-              <w:t>Verification</w:t>
-            </w:r>
-          </w:p>
-        </w:tc>
-        <w:tc>
-          <w:tcPr>
-            <w:tcW w:type="dxa" w:w="4968"/>
-            <w:vAlign w:val="center"/>
-            <w:shd w:fill="E2F0D9"/>
-          </w:tcPr>
-          <w:p>
-            <w:r>
-              <w:rPr>
-                <w:rFonts w:ascii="Aptos" w:hAnsi="Aptos"/>
-                <w:b/>
-                <w:sz w:val="18"/>
-              </w:rPr>
-              <w:t>Result</w:t>
-            </w:r>
-          </w:p>
-        </w:tc>
-      </w:tr>
-      <w:tr>
-        <w:tc>
-          <w:tcPr>
-            <w:tcW w:type="dxa" w:w="4968"/>
-            <w:vAlign w:val="center"/>
-          </w:tcPr>
-          <w:p>
-            <w:r>
-              <w:rPr>
-                <w:rFonts w:ascii="Aptos" w:hAnsi="Aptos"/>
-                <w:sz w:val="18"/>
-              </w:rPr>
-              <w:t>Automated tests</w:t>
-            </w:r>
-          </w:p>
-        </w:tc>
-        <w:tc>
-          <w:tcPr>
-            <w:tcW w:type="dxa" w:w="4968"/>
-            <w:vAlign w:val="center"/>
-          </w:tcPr>
-          <w:p>
-            <w:r>
-              <w:rPr>
-                <w:rFonts w:ascii="Aptos" w:hAnsi="Aptos"/>
-                <w:sz w:val="18"/>
-              </w:rPr>
-              <w:t>23 passed</w:t>
-            </w:r>
-          </w:p>
-        </w:tc>
-      </w:tr>
-      <w:tr>
-        <w:tc>
-          <w:tcPr>
-            <w:tcW w:type="dxa" w:w="4968"/>
-            <w:vAlign w:val="center"/>
-          </w:tcPr>
-          <w:p>
-            <w:r>
-              <w:rPr>
-                <w:rFonts w:ascii="Aptos" w:hAnsi="Aptos"/>
-                <w:sz w:val="18"/>
-              </w:rPr>
-              <w:t>Application startup</w:t>
-            </w:r>
-          </w:p>
-        </w:tc>
-        <w:tc>
-          <w:tcPr>
-            <w:tcW w:type="dxa" w:w="4968"/>
-            <w:vAlign w:val="center"/>
-          </w:tcPr>
-          <w:p>
-            <w:r>
-              <w:rPr>
-                <w:rFonts w:ascii="Aptos" w:hAnsi="Aptos"/>
-                <w:sz w:val="18"/>
-              </w:rPr>
-              <w:t>Successful</w:t>
-            </w:r>
-          </w:p>
-        </w:tc>
-      </w:tr>
-      <w:tr>
-        <w:tc>
-          <w:tcPr>
-            <w:tcW w:type="dxa" w:w="4968"/>
-            <w:vAlign w:val="center"/>
-          </w:tcPr>
-          <w:p>
-            <w:r>
-              <w:rPr>
-                <w:rFonts w:ascii="Aptos" w:hAnsi="Aptos"/>
-                <w:sz w:val="18"/>
-              </w:rPr>
-              <w:t>Git working tree</w:t>
-            </w:r>
-          </w:p>
-        </w:tc>
-        <w:tc>
-          <w:tcPr>
-            <w:tcW w:type="dxa" w:w="4968"/>
-            <w:vAlign w:val="center"/>
-          </w:tcPr>
-          <w:p>
-            <w:r>
-              <w:rPr>
-                <w:rFonts w:ascii="Aptos" w:hAnsi="Aptos"/>
-                <w:sz w:val="18"/>
-              </w:rPr>
-              <w:t>Clean</w:t>
-            </w:r>
-          </w:p>
-        </w:tc>
-      </w:tr>
-      <w:tr>
-        <w:tc>
-          <w:tcPr>
-            <w:tcW w:type="dxa" w:w="4968"/>
-            <w:vAlign w:val="center"/>
-          </w:tcPr>
-          <w:p>
-            <w:r>
-              <w:rPr>
-                <w:rFonts w:ascii="Aptos" w:hAnsi="Aptos"/>
-                <w:sz w:val="18"/>
-              </w:rPr>
-              <w:t>Branch state</w:t>
-            </w:r>
-          </w:p>
-        </w:tc>
-        <w:tc>
-          <w:tcPr>
-            <w:tcW w:type="dxa" w:w="4968"/>
-            <w:vAlign w:val="center"/>
-          </w:tcPr>
-          <w:p>
-            <w:r>
-              <w:rPr>
-                <w:rFonts w:ascii="Aptos" w:hAnsi="Aptos"/>
-                <w:sz w:val="18"/>
-              </w:rPr>
-              <w:t>main up to date with origin/main</w:t>
-            </w:r>
-          </w:p>
-        </w:tc>
-      </w:tr>
-    </w:tbl>
-    <w:p>
-      <w:pPr>
-        <w:pStyle w:val="Heading1"/>
-      </w:pPr>
-      <w:r>
-        <w:t>2. Phase 3 Purpose</w:t>
-      </w:r>
-    </w:p>
-    <w:p>
-      <w:r>
-        <w:t>Phase 3 establishes the first real NOVYRA OS domain model layer. The goal is to stop treating the application as only a startup/configuration/service shell and begin defining the durable business concepts that the system will manipulate over time.</w:t>
+        <w:t>Opportunity is the first business-domain entity introduced in NOVYRA OS. It represents a potentially valuable opportunity discovered from an external or internal source.</w:t>
       </w:r>
     </w:p>
     <w:p>
@@ -661,7 +353,7 @@
         <w:pStyle w:val="ListBullet"/>
       </w:pPr>
       <w:r>
-        <w:t>Define the first core domain entities for NOVYRA OS.</w:t>
+        <w:t>id — stable identifier for the opportunity.</w:t>
       </w:r>
     </w:p>
     <w:p>
@@ -669,7 +361,7 @@
         <w:pStyle w:val="ListBullet"/>
       </w:pPr>
       <w:r>
-        <w:t>Create domain model conventions that can scale across future phases.</w:t>
+        <w:t>title — required human-readable opportunity title.</w:t>
       </w:r>
     </w:p>
     <w:p>
@@ -677,7 +369,7 @@
         <w:pStyle w:val="ListBullet"/>
       </w:pPr>
       <w:r>
-        <w:t>Introduce validation, identifiers, and immutable or controlled model state where appropriate.</w:t>
+        <w:t>source — required origin of the opportunity.</w:t>
       </w:r>
     </w:p>
     <w:p>
@@ -685,7 +377,7 @@
         <w:pStyle w:val="ListBullet"/>
       </w:pPr>
       <w:r>
-        <w:t>Keep business concepts separate from orchestration and infrastructure.</w:t>
+        <w:t>description — optional descriptive text.</w:t>
       </w:r>
     </w:p>
     <w:p>
@@ -693,20 +385,56 @@
         <w:pStyle w:val="ListBullet"/>
       </w:pPr>
       <w:r>
-        <w:t>Prepare the codebase for persistence, ranking, analytics, and integrations in later phases.</w:t>
+        <w:t>metadata — optional structured dictionary for extensible attributes.</w:t>
+      </w:r>
+    </w:p>
+    <w:p>
+      <w:r>
+        <w:t>Required identifiers, titles, and sources are validated at construction time so invalid domain objects cannot be created silently.</w:t>
       </w:r>
     </w:p>
     <w:p>
       <w:pPr>
-        <w:pStyle w:val="Heading1"/>
+        <w:pStyle w:val="Heading2"/>
       </w:pPr>
       <w:r>
-        <w:t>3. Phase 3 Scope</w:t>
+        <w:t>5. Opportunity Service Layer</w:t>
       </w:r>
     </w:p>
     <w:p>
       <w:r>
-        <w:t>Phase 3 is intentionally focused. It does not attempt to finish the entire platform. Instead, it creates the domain vocabulary and model boundaries that later phases will rely on.</w:t>
+        <w:t>The Opportunity service provides create_opportunity(). It coordinates domain-object construction and translates validation failures into the standardized ServiceResult contract.</w:t>
+      </w:r>
+    </w:p>
+    <w:p>
+      <w:r>
+        <w:t>Valid input produces a successful ServiceResult containing the Opportunity and a confirmation message. Invalid input produces a failed ServiceResult with the machine-readable error code OPPORTUNITY_VALIDATION_ERROR.</w:t>
+      </w:r>
+    </w:p>
+    <w:p>
+      <w:pPr>
+        <w:pStyle w:val="Heading2"/>
+      </w:pPr>
+      <w:r>
+        <w:t>6. ServiceResult Integration</w:t>
+      </w:r>
+    </w:p>
+    <w:p>
+      <w:r>
+        <w:t>The Opportunity service builds on the immutable ServiceResult abstraction established in Phase 2. This creates a consistent pattern for future application services: successful operations return data and a message, while failures return a message and error code.</w:t>
+      </w:r>
+    </w:p>
+    <w:p>
+      <w:pPr>
+        <w:pStyle w:val="Heading2"/>
+      </w:pPr>
+      <w:r>
+        <w:t>7. Automated Test Coverage</w:t>
+      </w:r>
+    </w:p>
+    <w:p>
+      <w:r>
+        <w:t>The Phase 3 test suite contains 33 passing tests. New coverage includes shared model helpers, Opportunity creation and validation, and Opportunity service success and failure paths.</w:t>
       </w:r>
     </w:p>
     <w:p>
@@ -714,7 +442,7 @@
         <w:pStyle w:val="ListBullet"/>
       </w:pPr>
       <w:r>
-        <w:t>Create the model-layer folder and file conventions.</w:t>
+        <w:t>test_model_base.py — validation and normalization helper behavior.</w:t>
       </w:r>
     </w:p>
     <w:p>
@@ -722,7 +450,7 @@
         <w:pStyle w:val="ListBullet"/>
       </w:pPr>
       <w:r>
-        <w:t>Define the first core entity or entities used by NOVYRA OS.</w:t>
+        <w:t>test_opportunity.py — Opportunity construction and required-field validation.</w:t>
       </w:r>
     </w:p>
     <w:p>
@@ -730,7 +458,43 @@
         <w:pStyle w:val="ListBullet"/>
       </w:pPr>
       <w:r>
-        <w:t>Establish validation rules and serialization conventions.</w:t>
+        <w:t>test_opportunity_service.py — successful creation and validation-error handling.</w:t>
+      </w:r>
+    </w:p>
+    <w:p>
+      <w:r>
+        <w:t>Latest verification: 33 passed in 0.18s.</w:t>
+      </w:r>
+    </w:p>
+    <w:p>
+      <w:pPr>
+        <w:pStyle w:val="Heading2"/>
+      </w:pPr>
+      <w:r>
+        <w:t>8. Git Checkpoints</w:t>
+      </w:r>
+    </w:p>
+    <w:p>
+      <w:r>
+        <w:t>Commit 32cd6a1 — "Phase 3: add core opportunity model foundation". Pushed successfully to origin/main.</w:t>
+      </w:r>
+    </w:p>
+    <w:p>
+      <w:r>
+        <w:t>Commit d7487f2 — "Phase 3: add opportunity service layer". Pushed successfully to origin/main.</w:t>
+      </w:r>
+    </w:p>
+    <w:p>
+      <w:r>
+        <w:t>The latest repository status reported main synchronized with origin/main and a clean working tree.</w:t>
+      </w:r>
+    </w:p>
+    <w:p>
+      <w:pPr>
+        <w:pStyle w:val="Heading2"/>
+      </w:pPr>
+      <w:r>
+        <w:t>9. Current Architecture</w:t>
       </w:r>
     </w:p>
     <w:p>
@@ -738,7 +502,7 @@
         <w:pStyle w:val="ListBullet"/>
       </w:pPr>
       <w:r>
-        <w:t>Add unit tests for model behaviour.</w:t>
+        <w:t>app/core — configuration, logging, project metadata, paths, and ServiceResult.</w:t>
       </w:r>
     </w:p>
     <w:p>
@@ -746,7 +510,7 @@
         <w:pStyle w:val="ListBullet"/>
       </w:pPr>
       <w:r>
-        <w:t>Integrate models with the service layer where useful.</w:t>
+        <w:t>app/models — reusable validation helpers and domain entities.</w:t>
       </w:r>
     </w:p>
     <w:p>
@@ -754,15 +518,7 @@
         <w:pStyle w:val="ListBullet"/>
       </w:pPr>
       <w:r>
-        <w:t>Document the model design decisions and test outcomes.</w:t>
-      </w:r>
-    </w:p>
-    <w:p>
-      <w:pPr>
-        <w:pStyle w:val="Heading1"/>
-      </w:pPr>
-      <w:r>
-        <w:t>4. What Phase 3 Will Not Include</w:t>
+        <w:t>app/services — application services coordinating domain operations.</w:t>
       </w:r>
     </w:p>
     <w:p>
@@ -770,7 +526,7 @@
         <w:pStyle w:val="ListBullet"/>
       </w:pPr>
       <w:r>
-        <w:t>Full database implementation.</w:t>
+        <w:t>app/utils — reserved utility layer.</w:t>
       </w:r>
     </w:p>
     <w:p>
@@ -778,528 +534,15 @@
         <w:pStyle w:val="ListBullet"/>
       </w:pPr>
       <w:r>
-        <w:t>External API integrations.</w:t>
+        <w:t>tests — automated regression and unit tests.</w:t>
       </w:r>
     </w:p>
     <w:p>
       <w:pPr>
-        <w:pStyle w:val="ListBullet"/>
+        <w:pStyle w:val="Heading2"/>
       </w:pPr>
       <w:r>
-        <w:t>AI/LLM integration.</w:t>
-      </w:r>
-    </w:p>
-    <w:p>
-      <w:pPr>
-        <w:pStyle w:val="ListBullet"/>
-      </w:pPr>
-      <w:r>
-        <w:t>Automation workflows.</w:t>
-      </w:r>
-    </w:p>
-    <w:p>
-      <w:pPr>
-        <w:pStyle w:val="ListBullet"/>
-      </w:pPr>
-      <w:r>
-        <w:t>Deployment infrastructure.</w:t>
-      </w:r>
-    </w:p>
-    <w:p>
-      <w:pPr>
-        <w:pStyle w:val="ListBullet"/>
-      </w:pPr>
-      <w:r>
-        <w:t>User interface work beyond what is needed to support the domain layer.</w:t>
-      </w:r>
-    </w:p>
-    <w:p>
-      <w:pPr>
-        <w:pStyle w:val="Heading1"/>
-      </w:pPr>
-      <w:r>
-        <w:t>5. Proposed Phase 3 Architecture</w:t>
-      </w:r>
-    </w:p>
-    <w:p>
-      <w:r>
-        <w:t>Phase 3 extends the Phase 2 foundation by adding a proper domain layer between services and any future persistence or external integration layers.</w:t>
-      </w:r>
-    </w:p>
-    <w:p>
-      <w:pPr>
-        <w:spacing w:before="60" w:after="120"/>
-        <w:ind w:left="360"/>
-      </w:pPr>
-      <w:r>
-        <w:rPr>
-          <w:rFonts w:ascii="Consolas" w:hAnsi="Consolas"/>
-          <w:sz w:val="18"/>
-        </w:rPr>
-        <w:t>main.py</w:t>
-        <w:br/>
-        <w:t xml:space="preserve">   │</w:t>
-        <w:br/>
-        <w:t xml:space="preserve">   ▼</w:t>
-        <w:br/>
-        <w:t>services/</w:t>
-        <w:br/>
-        <w:t xml:space="preserve">   │</w:t>
-        <w:br/>
-        <w:t xml:space="preserve">   ▼</w:t>
-        <w:br/>
-        <w:t>models/</w:t>
-        <w:br/>
-        <w:t xml:space="preserve">   │</w:t>
-        <w:br/>
-        <w:t xml:space="preserve">   ├── entities</w:t>
-        <w:br/>
-        <w:t xml:space="preserve">   ├── value objects</w:t>
-        <w:br/>
-        <w:t xml:space="preserve">   ├── validation rules</w:t>
-        <w:br/>
-        <w:t xml:space="preserve">   └── serialization helpers</w:t>
-        <w:br/>
-        <w:t xml:space="preserve">   │</w:t>
-        <w:br/>
-        <w:t xml:space="preserve">   ▼</w:t>
-        <w:br/>
-        <w:t>future repositories / database / APIs</w:t>
-      </w:r>
-    </w:p>
-    <w:p>
-      <w:r>
-        <w:t>Proposed structural direction:</w:t>
-      </w:r>
-    </w:p>
-    <w:p>
-      <w:pPr>
-        <w:spacing w:before="60" w:after="120"/>
-        <w:ind w:left="360"/>
-      </w:pPr>
-      <w:r>
-        <w:rPr>
-          <w:rFonts w:ascii="Consolas" w:hAnsi="Consolas"/>
-          <w:sz w:val="18"/>
-        </w:rPr>
-        <w:t>02_SOURCE_CODE/</w:t>
-        <w:br/>
-        <w:t>└── app/</w:t>
-        <w:br/>
-        <w:t xml:space="preserve">    ├── core/</w:t>
-        <w:br/>
-        <w:t xml:space="preserve">    ├── models/</w:t>
-        <w:br/>
-        <w:t xml:space="preserve">    │   ├── base_model.py</w:t>
-        <w:br/>
-        <w:t xml:space="preserve">    │   ├── identifiers.py</w:t>
-        <w:br/>
-        <w:t xml:space="preserve">    │   ├── &lt;first_domain_entity&gt;.py</w:t>
-        <w:br/>
-        <w:t xml:space="preserve">    │   └── __init__.py</w:t>
-        <w:br/>
-        <w:t xml:space="preserve">    ├── services/</w:t>
-        <w:br/>
-        <w:t xml:space="preserve">    ├── utils/</w:t>
-        <w:br/>
-        <w:t xml:space="preserve">    └── main.py</w:t>
-      </w:r>
-    </w:p>
-    <w:p>
-      <w:pPr>
-        <w:pStyle w:val="Heading1"/>
-      </w:pPr>
-      <w:r>
-        <w:t>6. Domain Modelling Principles</w:t>
-      </w:r>
-    </w:p>
-    <w:p>
-      <w:pPr>
-        <w:pStyle w:val="ListBullet"/>
-      </w:pPr>
-      <w:r>
-        <w:t>Keep domain concepts explicit and named after real business meaning.</w:t>
-      </w:r>
-    </w:p>
-    <w:p>
-      <w:pPr>
-        <w:pStyle w:val="ListBullet"/>
-      </w:pPr>
-      <w:r>
-        <w:t>Prefer small, coherent models over oversized catch-all objects.</w:t>
-      </w:r>
-    </w:p>
-    <w:p>
-      <w:pPr>
-        <w:pStyle w:val="ListBullet"/>
-      </w:pPr>
-      <w:r>
-        <w:t>Validate at the boundary rather than allowing invalid state to spread.</w:t>
-      </w:r>
-    </w:p>
-    <w:p>
-      <w:pPr>
-        <w:pStyle w:val="ListBullet"/>
-      </w:pPr>
-      <w:r>
-        <w:t>Use clear field names and stable identifiers.</w:t>
-      </w:r>
-    </w:p>
-    <w:p>
-      <w:pPr>
-        <w:pStyle w:val="ListBullet"/>
-      </w:pPr>
-      <w:r>
-        <w:t>Make model behaviour testable in isolation.</w:t>
-      </w:r>
-    </w:p>
-    <w:p>
-      <w:pPr>
-        <w:pStyle w:val="ListBullet"/>
-      </w:pPr>
-      <w:r>
-        <w:t>Keep domain logic out of the entry point and out of infrastructure modules.</w:t>
-      </w:r>
-    </w:p>
-    <w:p>
-      <w:pPr>
-        <w:pStyle w:val="Heading1"/>
-      </w:pPr>
-      <w:r>
-        <w:t>7. Candidate Domain Areas</w:t>
-      </w:r>
-    </w:p>
-    <w:p>
-      <w:r>
-        <w:t>The exact first entity will be finalized during implementation, but the likely domain areas are:</w:t>
-      </w:r>
-    </w:p>
-    <w:p>
-      <w:pPr>
-        <w:pStyle w:val="ListBullet"/>
-      </w:pPr>
-      <w:r>
-        <w:t>Opportunity records or opportunity summaries.</w:t>
-      </w:r>
-    </w:p>
-    <w:p>
-      <w:pPr>
-        <w:pStyle w:val="ListBullet"/>
-      </w:pPr>
-      <w:r>
-        <w:t>User profile / preferences / goals.</w:t>
-      </w:r>
-    </w:p>
-    <w:p>
-      <w:pPr>
-        <w:pStyle w:val="ListBullet"/>
-      </w:pPr>
-      <w:r>
-        <w:t>Source records or feed items.</w:t>
-      </w:r>
-    </w:p>
-    <w:p>
-      <w:pPr>
-        <w:pStyle w:val="ListBullet"/>
-      </w:pPr>
-      <w:r>
-        <w:t>Scores, rankings, and decision outputs.</w:t>
-      </w:r>
-    </w:p>
-    <w:p>
-      <w:pPr>
-        <w:pStyle w:val="ListBullet"/>
-      </w:pPr>
-      <w:r>
-        <w:t>Audit-friendly event or outcome records.</w:t>
-      </w:r>
-    </w:p>
-    <w:p>
-      <w:pPr>
-        <w:pStyle w:val="Heading1"/>
-      </w:pPr>
-      <w:r>
-        <w:t>8. Validation and Data Rules</w:t>
-      </w:r>
-    </w:p>
-    <w:p>
-      <w:r>
-        <w:t>Phase 3 should define how NOVYRA OS validates the data it stores and manipulates. The goal is to avoid ambiguous records and prevent model drift early in the lifecycle.</w:t>
-      </w:r>
-    </w:p>
-    <w:p>
-      <w:pPr>
-        <w:pStyle w:val="ListBullet"/>
-      </w:pPr>
-      <w:r>
-        <w:t>Required vs optional fields.</w:t>
-      </w:r>
-    </w:p>
-    <w:p>
-      <w:pPr>
-        <w:pStyle w:val="ListBullet"/>
-      </w:pPr>
-      <w:r>
-        <w:t>Identifier format and uniqueness.</w:t>
-      </w:r>
-    </w:p>
-    <w:p>
-      <w:pPr>
-        <w:pStyle w:val="ListBullet"/>
-      </w:pPr>
-      <w:r>
-        <w:t>Type constraints and normalization rules.</w:t>
-      </w:r>
-    </w:p>
-    <w:p>
-      <w:pPr>
-        <w:pStyle w:val="ListBullet"/>
-      </w:pPr>
-      <w:r>
-        <w:t>Date/time handling conventions.</w:t>
-      </w:r>
-    </w:p>
-    <w:p>
-      <w:pPr>
-        <w:pStyle w:val="ListBullet"/>
-      </w:pPr>
-      <w:r>
-        <w:t>Text length and canonicalization rules.</w:t>
-      </w:r>
-    </w:p>
-    <w:p>
-      <w:pPr>
-        <w:pStyle w:val="ListBullet"/>
-      </w:pPr>
-      <w:r>
-        <w:t>Serialization and deserialization expectations.</w:t>
-      </w:r>
-    </w:p>
-    <w:p>
-      <w:pPr>
-        <w:pStyle w:val="Heading1"/>
-      </w:pPr>
-      <w:r>
-        <w:t>9. Testing Strategy</w:t>
-      </w:r>
-    </w:p>
-    <w:p>
-      <w:r>
-        <w:t>Every model or domain rule introduced in Phase 3 should be covered by unit tests. Tests should focus on both valid and invalid data, boundary conditions, and stable serialization/representation.</w:t>
-      </w:r>
-    </w:p>
-    <w:tbl>
-      <w:tblPr>
-        <w:tblStyle w:val="TableGrid"/>
-        <w:tblW w:type="auto" w:w="0"/>
-        <w:jc w:val="center"/>
-        <w:tblLook w:firstColumn="1" w:firstRow="1" w:lastColumn="0" w:lastRow="0" w:noHBand="0" w:noVBand="1" w:val="04A0"/>
-      </w:tblPr>
-      <w:tblGrid>
-        <w:gridCol w:w="4968"/>
-        <w:gridCol w:w="4968"/>
-      </w:tblGrid>
-      <w:tr>
-        <w:tc>
-          <w:tcPr>
-            <w:tcW w:type="dxa" w:w="4968"/>
-            <w:vAlign w:val="center"/>
-            <w:shd w:fill="D9EAD3"/>
-          </w:tcPr>
-          <w:p>
-            <w:r>
-              <w:rPr>
-                <w:rFonts w:ascii="Aptos" w:hAnsi="Aptos"/>
-                <w:b/>
-                <w:sz w:val="18"/>
-              </w:rPr>
-              <w:t>Test Category</w:t>
-            </w:r>
-          </w:p>
-        </w:tc>
-        <w:tc>
-          <w:tcPr>
-            <w:tcW w:type="dxa" w:w="4968"/>
-            <w:vAlign w:val="center"/>
-            <w:shd w:fill="D9EAD3"/>
-          </w:tcPr>
-          <w:p>
-            <w:r>
-              <w:rPr>
-                <w:rFonts w:ascii="Aptos" w:hAnsi="Aptos"/>
-                <w:b/>
-                <w:sz w:val="18"/>
-              </w:rPr>
-              <w:t>Expected Coverage</w:t>
-            </w:r>
-          </w:p>
-        </w:tc>
-      </w:tr>
-      <w:tr>
-        <w:tc>
-          <w:tcPr>
-            <w:tcW w:type="dxa" w:w="4968"/>
-            <w:vAlign w:val="center"/>
-          </w:tcPr>
-          <w:p>
-            <w:r>
-              <w:rPr>
-                <w:rFonts w:ascii="Aptos" w:hAnsi="Aptos"/>
-                <w:sz w:val="18"/>
-              </w:rPr>
-              <w:t>Model creation</w:t>
-            </w:r>
-          </w:p>
-        </w:tc>
-        <w:tc>
-          <w:tcPr>
-            <w:tcW w:type="dxa" w:w="4968"/>
-            <w:vAlign w:val="center"/>
-          </w:tcPr>
-          <w:p>
-            <w:r>
-              <w:rPr>
-                <w:rFonts w:ascii="Aptos" w:hAnsi="Aptos"/>
-                <w:sz w:val="18"/>
-              </w:rPr>
-              <w:t>Valid construction with required fields</w:t>
-            </w:r>
-          </w:p>
-        </w:tc>
-      </w:tr>
-      <w:tr>
-        <w:tc>
-          <w:tcPr>
-            <w:tcW w:type="dxa" w:w="4968"/>
-            <w:vAlign w:val="center"/>
-          </w:tcPr>
-          <w:p>
-            <w:r>
-              <w:rPr>
-                <w:rFonts w:ascii="Aptos" w:hAnsi="Aptos"/>
-                <w:sz w:val="18"/>
-              </w:rPr>
-              <w:t>Model validation</w:t>
-            </w:r>
-          </w:p>
-        </w:tc>
-        <w:tc>
-          <w:tcPr>
-            <w:tcW w:type="dxa" w:w="4968"/>
-            <w:vAlign w:val="center"/>
-          </w:tcPr>
-          <w:p>
-            <w:r>
-              <w:rPr>
-                <w:rFonts w:ascii="Aptos" w:hAnsi="Aptos"/>
-                <w:sz w:val="18"/>
-              </w:rPr>
-              <w:t>Invalid or missing data rejected cleanly</w:t>
-            </w:r>
-          </w:p>
-        </w:tc>
-      </w:tr>
-      <w:tr>
-        <w:tc>
-          <w:tcPr>
-            <w:tcW w:type="dxa" w:w="4968"/>
-            <w:vAlign w:val="center"/>
-          </w:tcPr>
-          <w:p>
-            <w:r>
-              <w:rPr>
-                <w:rFonts w:ascii="Aptos" w:hAnsi="Aptos"/>
-                <w:sz w:val="18"/>
-              </w:rPr>
-              <w:t>Serialization</w:t>
-            </w:r>
-          </w:p>
-        </w:tc>
-        <w:tc>
-          <w:tcPr>
-            <w:tcW w:type="dxa" w:w="4968"/>
-            <w:vAlign w:val="center"/>
-          </w:tcPr>
-          <w:p>
-            <w:r>
-              <w:rPr>
-                <w:rFonts w:ascii="Aptos" w:hAnsi="Aptos"/>
-                <w:sz w:val="18"/>
-              </w:rPr>
-              <w:t>Model representation remains stable and testable</w:t>
-            </w:r>
-          </w:p>
-        </w:tc>
-      </w:tr>
-      <w:tr>
-        <w:tc>
-          <w:tcPr>
-            <w:tcW w:type="dxa" w:w="4968"/>
-            <w:vAlign w:val="center"/>
-          </w:tcPr>
-          <w:p>
-            <w:r>
-              <w:rPr>
-                <w:rFonts w:ascii="Aptos" w:hAnsi="Aptos"/>
-                <w:sz w:val="18"/>
-              </w:rPr>
-              <w:t>Integration</w:t>
-            </w:r>
-          </w:p>
-        </w:tc>
-        <w:tc>
-          <w:tcPr>
-            <w:tcW w:type="dxa" w:w="4968"/>
-            <w:vAlign w:val="center"/>
-          </w:tcPr>
-          <w:p>
-            <w:r>
-              <w:rPr>
-                <w:rFonts w:ascii="Aptos" w:hAnsi="Aptos"/>
-                <w:sz w:val="18"/>
-              </w:rPr>
-              <w:t>Service layer can consume the model correctly</w:t>
-            </w:r>
-          </w:p>
-        </w:tc>
-      </w:tr>
-    </w:tbl>
-    <w:p>
-      <w:pPr>
-        <w:pStyle w:val="Heading1"/>
-      </w:pPr>
-      <w:r>
-        <w:t>10. Documentation Strategy</w:t>
-      </w:r>
-    </w:p>
-    <w:p>
-      <w:r>
-        <w:t>Phase 3 will keep its own standalone master documentation file under 00_PROJECT_DOCUMENTATION. The document will be updated as implementation progresses, but it will remain phase-specific and separate from future phases.</w:t>
-      </w:r>
-    </w:p>
-    <w:p>
-      <w:pPr>
-        <w:spacing w:before="60" w:after="120"/>
-        <w:ind w:left="360"/>
-      </w:pPr>
-      <w:r>
-        <w:rPr>
-          <w:rFonts w:ascii="Consolas" w:hAnsi="Consolas"/>
-          <w:sz w:val="18"/>
-        </w:rPr>
-        <w:t>00_PROJECT_DOCUMENTATION/</w:t>
-        <w:br/>
-        <w:t>└── Phase_3_Core_Domain_Model_Foundation/</w:t>
-        <w:br/>
-        <w:t xml:space="preserve">    └── NOVYRA_OS_Phase_3_Master_Documentation.docx</w:t>
-      </w:r>
-    </w:p>
-    <w:p>
-      <w:pPr>
-        <w:pStyle w:val="Heading1"/>
-      </w:pPr>
-      <w:r>
-        <w:t>11. Implementation Sequence</w:t>
+        <w:t>10. Next Phase 3 Steps</w:t>
       </w:r>
     </w:p>
     <w:p>
@@ -1307,7 +550,7 @@
         <w:pStyle w:val="ListNumber"/>
       </w:pPr>
       <w:r>
-        <w:t>Confirm the first domain concept to model.</w:t>
+        <w:t>Introduce the next core domain entity and define its validation rules.</w:t>
       </w:r>
     </w:p>
     <w:p>
@@ -1315,7 +558,7 @@
         <w:pStyle w:val="ListNumber"/>
       </w:pPr>
       <w:r>
-        <w:t>Create the model-layer files and module boundaries.</w:t>
+        <w:t>Connect related domain entities where appropriate.</w:t>
       </w:r>
     </w:p>
     <w:p>
@@ -1323,7 +566,7 @@
         <w:pStyle w:val="ListNumber"/>
       </w:pPr>
       <w:r>
-        <w:t>Implement the model and its validation rules.</w:t>
+        <w:t>Expand service-layer operations beyond creation.</w:t>
       </w:r>
     </w:p>
     <w:p>
@@ -1331,7 +574,7 @@
         <w:pStyle w:val="ListNumber"/>
       </w:pPr>
       <w:r>
-        <w:t>Add tests for valid and invalid behaviour.</w:t>
+        <w:t>Define persistence boundaries before introducing a database implementation.</w:t>
       </w:r>
     </w:p>
     <w:p>
@@ -1339,488 +582,30 @@
         <w:pStyle w:val="ListNumber"/>
       </w:pPr>
       <w:r>
-        <w:t>Integrate the model with the existing service layer.</w:t>
+        <w:t>Add integration tests once multiple domain services interact.</w:t>
       </w:r>
     </w:p>
     <w:p>
       <w:pPr>
-        <w:pStyle w:val="ListNumber"/>
+        <w:pStyle w:val="Heading2"/>
       </w:pPr>
       <w:r>
-        <w:t>Update the Phase 3 documentation with the implementation record.</w:t>
-      </w:r>
-    </w:p>
-    <w:p>
-      <w:pPr>
-        <w:pStyle w:val="ListNumber"/>
-      </w:pPr>
-      <w:r>
-        <w:t>Run the full test suite and verify the application still starts cleanly.</w:t>
-      </w:r>
-    </w:p>
-    <w:p>
-      <w:pPr>
-        <w:pStyle w:val="ListNumber"/>
-      </w:pPr>
-      <w:r>
-        <w:t>Commit and push the phase checkpoint to GitHub.</w:t>
-      </w:r>
-    </w:p>
-    <w:p>
-      <w:pPr>
-        <w:pStyle w:val="Heading1"/>
-      </w:pPr>
-      <w:r>
-        <w:t>12. Risks and Mitigations</w:t>
-      </w:r>
-    </w:p>
-    <w:tbl>
-      <w:tblPr>
-        <w:tblStyle w:val="TableGrid"/>
-        <w:tblW w:type="auto" w:w="0"/>
-        <w:jc w:val="center"/>
-        <w:tblLook w:firstColumn="1" w:firstRow="1" w:lastColumn="0" w:lastRow="0" w:noHBand="0" w:noVBand="1" w:val="04A0"/>
-      </w:tblPr>
-      <w:tblGrid>
-        <w:gridCol w:w="4968"/>
-        <w:gridCol w:w="4968"/>
-      </w:tblGrid>
-      <w:tr>
-        <w:tc>
-          <w:tcPr>
-            <w:tcW w:type="dxa" w:w="4968"/>
-            <w:vAlign w:val="center"/>
-            <w:shd w:fill="F4CCCC"/>
-          </w:tcPr>
-          <w:p>
-            <w:r>
-              <w:rPr>
-                <w:rFonts w:ascii="Aptos" w:hAnsi="Aptos"/>
-                <w:b/>
-                <w:sz w:val="18"/>
-              </w:rPr>
-              <w:t>Risk</w:t>
-            </w:r>
-          </w:p>
-        </w:tc>
-        <w:tc>
-          <w:tcPr>
-            <w:tcW w:type="dxa" w:w="4968"/>
-            <w:vAlign w:val="center"/>
-            <w:shd w:fill="F4CCCC"/>
-          </w:tcPr>
-          <w:p>
-            <w:r>
-              <w:rPr>
-                <w:rFonts w:ascii="Aptos" w:hAnsi="Aptos"/>
-                <w:b/>
-                <w:sz w:val="18"/>
-              </w:rPr>
-              <w:t>Mitigation</w:t>
-            </w:r>
-          </w:p>
-        </w:tc>
-      </w:tr>
-      <w:tr>
-        <w:tc>
-          <w:tcPr>
-            <w:tcW w:type="dxa" w:w="4968"/>
-            <w:vAlign w:val="center"/>
-          </w:tcPr>
-          <w:p>
-            <w:r>
-              <w:rPr>
-                <w:rFonts w:ascii="Aptos" w:hAnsi="Aptos"/>
-                <w:sz w:val="18"/>
-              </w:rPr>
-              <w:t>Overengineering the domain layer</w:t>
-            </w:r>
-          </w:p>
-        </w:tc>
-        <w:tc>
-          <w:tcPr>
-            <w:tcW w:type="dxa" w:w="4968"/>
-            <w:vAlign w:val="center"/>
-          </w:tcPr>
-          <w:p>
-            <w:r>
-              <w:rPr>
-                <w:rFonts w:ascii="Aptos" w:hAnsi="Aptos"/>
-                <w:sz w:val="18"/>
-              </w:rPr>
-              <w:t>Start with a single useful entity and expand only when necessary.</w:t>
-            </w:r>
-          </w:p>
-        </w:tc>
-      </w:tr>
-      <w:tr>
-        <w:tc>
-          <w:tcPr>
-            <w:tcW w:type="dxa" w:w="4968"/>
-            <w:vAlign w:val="center"/>
-          </w:tcPr>
-          <w:p>
-            <w:r>
-              <w:rPr>
-                <w:rFonts w:ascii="Aptos" w:hAnsi="Aptos"/>
-                <w:sz w:val="18"/>
-              </w:rPr>
-              <w:t>Model sprawl</w:t>
-            </w:r>
-          </w:p>
-        </w:tc>
-        <w:tc>
-          <w:tcPr>
-            <w:tcW w:type="dxa" w:w="4968"/>
-            <w:vAlign w:val="center"/>
-          </w:tcPr>
-          <w:p>
-            <w:r>
-              <w:rPr>
-                <w:rFonts w:ascii="Aptos" w:hAnsi="Aptos"/>
-                <w:sz w:val="18"/>
-              </w:rPr>
-              <w:t>Keep entities small and purposeful.</w:t>
-            </w:r>
-          </w:p>
-        </w:tc>
-      </w:tr>
-      <w:tr>
-        <w:tc>
-          <w:tcPr>
-            <w:tcW w:type="dxa" w:w="4968"/>
-            <w:vAlign w:val="center"/>
-          </w:tcPr>
-          <w:p>
-            <w:r>
-              <w:rPr>
-                <w:rFonts w:ascii="Aptos" w:hAnsi="Aptos"/>
-                <w:sz w:val="18"/>
-              </w:rPr>
-              <w:t>Invalid state entering the system</w:t>
-            </w:r>
-          </w:p>
-        </w:tc>
-        <w:tc>
-          <w:tcPr>
-            <w:tcW w:type="dxa" w:w="4968"/>
-            <w:vAlign w:val="center"/>
-          </w:tcPr>
-          <w:p>
-            <w:r>
-              <w:rPr>
-                <w:rFonts w:ascii="Aptos" w:hAnsi="Aptos"/>
-                <w:sz w:val="18"/>
-              </w:rPr>
-              <w:t>Validate aggressively at construction or boundary points.</w:t>
-            </w:r>
-          </w:p>
-        </w:tc>
-      </w:tr>
-      <w:tr>
-        <w:tc>
-          <w:tcPr>
-            <w:tcW w:type="dxa" w:w="4968"/>
-            <w:vAlign w:val="center"/>
-          </w:tcPr>
-          <w:p>
-            <w:r>
-              <w:rPr>
-                <w:rFonts w:ascii="Aptos" w:hAnsi="Aptos"/>
-                <w:sz w:val="18"/>
-              </w:rPr>
-              <w:t>Coupling domain logic to services</w:t>
-            </w:r>
-          </w:p>
-        </w:tc>
-        <w:tc>
-          <w:tcPr>
-            <w:tcW w:type="dxa" w:w="4968"/>
-            <w:vAlign w:val="center"/>
-          </w:tcPr>
-          <w:p>
-            <w:r>
-              <w:rPr>
-                <w:rFonts w:ascii="Aptos" w:hAnsi="Aptos"/>
-                <w:sz w:val="18"/>
-              </w:rPr>
-              <w:t>Keep domain rules in models and orchestration in services.</w:t>
-            </w:r>
-          </w:p>
-        </w:tc>
-      </w:tr>
-      <w:tr>
-        <w:tc>
-          <w:tcPr>
-            <w:tcW w:type="dxa" w:w="4968"/>
-            <w:vAlign w:val="center"/>
-          </w:tcPr>
-          <w:p>
-            <w:r>
-              <w:rPr>
-                <w:rFonts w:ascii="Aptos" w:hAnsi="Aptos"/>
-                <w:sz w:val="18"/>
-              </w:rPr>
-              <w:t>Ambiguous naming</w:t>
-            </w:r>
-          </w:p>
-        </w:tc>
-        <w:tc>
-          <w:tcPr>
-            <w:tcW w:type="dxa" w:w="4968"/>
-            <w:vAlign w:val="center"/>
-          </w:tcPr>
-          <w:p>
-            <w:r>
-              <w:rPr>
-                <w:rFonts w:ascii="Aptos" w:hAnsi="Aptos"/>
-                <w:sz w:val="18"/>
-              </w:rPr>
-              <w:t>Use business-meaningful names and document each concept.</w:t>
-            </w:r>
-          </w:p>
-        </w:tc>
-      </w:tr>
-    </w:tbl>
-    <w:p>
-      <w:pPr>
-        <w:pStyle w:val="Heading1"/>
-      </w:pPr>
-      <w:r>
-        <w:t>13. Completion Criteria</w:t>
-      </w:r>
-    </w:p>
-    <w:p>
-      <w:pPr>
-        <w:pStyle w:val="ListBullet"/>
-      </w:pPr>
-      <w:r>
-        <w:t>At least one real domain model is implemented and tested.</w:t>
-      </w:r>
-    </w:p>
-    <w:p>
-      <w:pPr>
-        <w:pStyle w:val="ListBullet"/>
-      </w:pPr>
-      <w:r>
-        <w:t>Model validation rules are documented and enforced.</w:t>
-      </w:r>
-    </w:p>
-    <w:p>
-      <w:pPr>
-        <w:pStyle w:val="ListBullet"/>
-      </w:pPr>
-      <w:r>
-        <w:t>The service layer consumes the model cleanly where needed.</w:t>
-      </w:r>
-    </w:p>
-    <w:p>
-      <w:pPr>
-        <w:pStyle w:val="ListBullet"/>
-      </w:pPr>
-      <w:r>
-        <w:t>The application still runs successfully after model integration.</w:t>
-      </w:r>
-    </w:p>
-    <w:p>
-      <w:pPr>
-        <w:pStyle w:val="ListBullet"/>
-      </w:pPr>
-      <w:r>
-        <w:t>The full test suite passes.</w:t>
-      </w:r>
-    </w:p>
-    <w:p>
-      <w:pPr>
-        <w:pStyle w:val="ListBullet"/>
-      </w:pPr>
-      <w:r>
-        <w:t>The Phase 3 documentation records the implementation accurately.</w:t>
-      </w:r>
-    </w:p>
-    <w:p>
-      <w:pPr>
-        <w:pStyle w:val="ListBullet"/>
-      </w:pPr>
-      <w:r>
-        <w:t>Git status is clean after the phase checkpoint.</w:t>
-      </w:r>
-    </w:p>
-    <w:p>
-      <w:pPr>
-        <w:pStyle w:val="Heading1"/>
-      </w:pPr>
-      <w:r>
-        <w:t>14. Phase 3 Ready State</w:t>
+        <w:t>11. Engineering Decision</w:t>
       </w:r>
     </w:p>
     <w:p>
       <w:r>
-        <w:t>Phase 3 is ready to begin implementation. The platform now has a verified foundation from Phase 2, and the next architectural responsibility is to define NOVYRA OS's durable domain concepts.</w:t>
-      </w:r>
-    </w:p>
-    <w:p>
-      <w:pPr>
-        <w:pStyle w:val="Heading1"/>
-      </w:pPr>
-      <w:r>
-        <w:t>15. Change Log</w:t>
-      </w:r>
-    </w:p>
-    <w:tbl>
-      <w:tblPr>
-        <w:tblStyle w:val="TableGrid"/>
-        <w:tblW w:type="auto" w:w="0"/>
-        <w:jc w:val="center"/>
-        <w:tblLook w:firstColumn="1" w:firstRow="1" w:lastColumn="0" w:lastRow="0" w:noHBand="0" w:noVBand="1" w:val="04A0"/>
-      </w:tblPr>
-      <w:tblGrid>
-        <w:gridCol w:w="3312"/>
-        <w:gridCol w:w="3312"/>
-        <w:gridCol w:w="3312"/>
-      </w:tblGrid>
-      <w:tr>
-        <w:tc>
-          <w:tcPr>
-            <w:tcW w:type="dxa" w:w="3312"/>
-            <w:vAlign w:val="center"/>
-            <w:shd w:fill="D9EAF7"/>
-          </w:tcPr>
-          <w:p>
-            <w:r>
-              <w:rPr>
-                <w:rFonts w:ascii="Aptos" w:hAnsi="Aptos"/>
-                <w:b/>
-                <w:sz w:val="18"/>
-              </w:rPr>
-              <w:t>Revision</w:t>
-            </w:r>
-          </w:p>
-        </w:tc>
-        <w:tc>
-          <w:tcPr>
-            <w:tcW w:type="dxa" w:w="3312"/>
-            <w:vAlign w:val="center"/>
-            <w:shd w:fill="D9EAF7"/>
-          </w:tcPr>
-          <w:p>
-            <w:r>
-              <w:rPr>
-                <w:rFonts w:ascii="Aptos" w:hAnsi="Aptos"/>
-                <w:b/>
-                <w:sz w:val="18"/>
-              </w:rPr>
-              <w:t>Date</w:t>
-            </w:r>
-          </w:p>
-        </w:tc>
-        <w:tc>
-          <w:tcPr>
-            <w:tcW w:type="dxa" w:w="3312"/>
-            <w:vAlign w:val="center"/>
-            <w:shd w:fill="D9EAF7"/>
-          </w:tcPr>
-          <w:p>
-            <w:r>
-              <w:rPr>
-                <w:rFonts w:ascii="Aptos" w:hAnsi="Aptos"/>
-                <w:b/>
-                <w:sz w:val="18"/>
-              </w:rPr>
-              <w:t>Change</w:t>
-            </w:r>
-          </w:p>
-        </w:tc>
-      </w:tr>
-      <w:tr>
-        <w:tc>
-          <w:tcPr>
-            <w:tcW w:type="dxa" w:w="3312"/>
-            <w:vAlign w:val="center"/>
-          </w:tcPr>
-          <w:p>
-            <w:r>
-              <w:rPr>
-                <w:rFonts w:ascii="Aptos" w:hAnsi="Aptos"/>
-                <w:sz w:val="18"/>
-              </w:rPr>
-              <w:t>1.0</w:t>
-            </w:r>
-          </w:p>
-        </w:tc>
-        <w:tc>
-          <w:tcPr>
-            <w:tcW w:type="dxa" w:w="3312"/>
-            <w:vAlign w:val="center"/>
-          </w:tcPr>
-          <w:p>
-            <w:r>
-              <w:rPr>
-                <w:rFonts w:ascii="Aptos" w:hAnsi="Aptos"/>
-                <w:sz w:val="18"/>
-              </w:rPr>
-              <w:t>27 July 2026</w:t>
-            </w:r>
-          </w:p>
-        </w:tc>
-        <w:tc>
-          <w:tcPr>
-            <w:tcW w:type="dxa" w:w="3312"/>
-            <w:vAlign w:val="center"/>
-          </w:tcPr>
-          <w:p>
-            <w:r>
-              <w:rPr>
-                <w:rFonts w:ascii="Aptos" w:hAnsi="Aptos"/>
-                <w:sz w:val="18"/>
-              </w:rPr>
-              <w:t>Created the Phase 3 master documentation baseline for the core domain model foundation.</w:t>
-            </w:r>
-          </w:p>
-        </w:tc>
-      </w:tr>
-    </w:tbl>
-    <w:p>
-      <w:pPr>
-        <w:pStyle w:val="Heading1"/>
-      </w:pPr>
-      <w:r>
-        <w:t>16. Governance</w:t>
-      </w:r>
-    </w:p>
-    <w:p>
-      <w:r>
-        <w:t>This document is the official Phase 3 planning and implementation record. Once the phase begins, all major steps should be appended here and committed to the repository as part of the phase history. Future phases must receive their own standalone master documentation file.</w:t>
+        <w:t>NOVYRA OS will continue using a layered architecture in which domain models enforce invariants, services orchestrate business operations, and ServiceResult provides a stable boundary for success and failure communication. Persistence should be introduced only after domain boundaries are sufficiently defined, reducing premature coupling to a database.</w:t>
       </w:r>
     </w:p>
     <w:sectPr>
-      <w:footerReference w:type="default" r:id="rId9"/>
       <w:pgSz w:w="12240" w:h="15840"/>
-      <w:pgMar w:top="1008" w:right="1152" w:bottom="1008" w:left="1152" w:header="720" w:footer="720" w:gutter="0"/>
+      <w:pgMar w:top="1440" w:right="1800" w:bottom="1440" w:left="1800" w:header="720" w:footer="720" w:gutter="0"/>
       <w:cols w:space="720"/>
       <w:docGrid w:linePitch="360"/>
     </w:sectPr>
   </w:body>
 </w:document>
-</file>
-
-<file path=word/footer1.xml><?xml version="1.0" encoding="utf-8"?>
-<w:ftr xmlns:m="http://schemas.openxmlformats.org/officeDocument/2006/math" xmlns:mc="http://schemas.openxmlformats.org/markup-compatibility/2006" xmlns:mo="http://schemas.microsoft.com/office/mac/office/2008/main" xmlns:mv="urn:schemas-microsoft-com:mac:vml" xmlns:o="urn:schemas-microsoft-com:office:office" xmlns:r="http://schemas.openxmlformats.org/officeDocument/2006/relationships" xmlns:v="urn:schemas-microsoft-com:vml" xmlns:w10="urn:schemas-microsoft-com:office:word" xmlns:w14="http://schemas.microsoft.com/office/word/2010/wordml" xmlns:w="http://schemas.openxmlformats.org/wordprocessingml/2006/main" xmlns:wne="http://schemas.microsoft.com/office/word/2006/wordml" xmlns:wp14="http://schemas.microsoft.com/office/word/2010/wordprocessingDrawing" xmlns:wp="http://schemas.openxmlformats.org/drawingml/2006/wordprocessingDrawing" xmlns:wpc="http://schemas.microsoft.com/office/word/2010/wordprocessingCanvas" xmlns:wpg="http://schemas.microsoft.com/office/word/2010/wordprocessingGroup" xmlns:wpi="http://schemas.microsoft.com/office/word/2010/wordprocessingInk" xmlns:wps="http://schemas.microsoft.com/office/word/2010/wordprocessingShape" mc:Ignorable="w14 wp14">
-  <w:p>
-    <w:pPr>
-      <w:pStyle w:val="Footer"/>
-      <w:jc w:val="center"/>
-    </w:pPr>
-    <w:r>
-      <w:t xml:space="preserve">NOVYRA OS — Phase 3 Master Documentation | </w:t>
-    </w:r>
-    <w:r>
-      <w:fldChar w:fldCharType="begin"/>
-      <w:instrText xml:space="preserve">PAGE</w:instrText>
-      <w:fldChar w:fldCharType="end"/>
-    </w:r>
-  </w:p>
-</w:ftr>
 </file>
 
 <file path=word/numbering.xml><?xml version="1.0" encoding="utf-8"?>
@@ -2250,11 +1035,11 @@
       <w:outlineLvl w:val="0"/>
     </w:pPr>
     <w:rPr>
-      <w:rFonts w:asciiTheme="majorHAnsi" w:eastAsiaTheme="majorEastAsia" w:hAnsiTheme="majorHAnsi" w:cstheme="majorBidi" w:ascii="Aptos" w:hAnsi="Aptos"/>
+      <w:rFonts w:asciiTheme="majorHAnsi" w:eastAsiaTheme="majorEastAsia" w:hAnsiTheme="majorHAnsi" w:cstheme="majorBidi"/>
       <w:b/>
       <w:bCs/>
       <w:color w:val="365F91" w:themeColor="accent1" w:themeShade="BF"/>
-      <w:sz w:val="32"/>
+      <w:sz w:val="28"/>
       <w:szCs w:val="28"/>
     </w:rPr>
   </w:style>
@@ -2274,7 +1059,7 @@
       <w:outlineLvl w:val="1"/>
     </w:pPr>
     <w:rPr>
-      <w:rFonts w:asciiTheme="majorHAnsi" w:eastAsiaTheme="majorEastAsia" w:hAnsiTheme="majorHAnsi" w:cstheme="majorBidi" w:ascii="Aptos" w:hAnsi="Aptos"/>
+      <w:rFonts w:asciiTheme="majorHAnsi" w:eastAsiaTheme="majorEastAsia" w:hAnsiTheme="majorHAnsi" w:cstheme="majorBidi"/>
       <w:b/>
       <w:bCs/>
       <w:color w:val="4F81BD" w:themeColor="accent1"/>
@@ -2298,11 +1083,10 @@
       <w:outlineLvl w:val="2"/>
     </w:pPr>
     <w:rPr>
-      <w:rFonts w:asciiTheme="majorHAnsi" w:eastAsiaTheme="majorEastAsia" w:hAnsiTheme="majorHAnsi" w:cstheme="majorBidi" w:ascii="Aptos" w:hAnsi="Aptos"/>
+      <w:rFonts w:asciiTheme="majorHAnsi" w:eastAsiaTheme="majorEastAsia" w:hAnsiTheme="majorHAnsi" w:cstheme="majorBidi"/>
       <w:b/>
       <w:bCs/>
       <w:color w:val="4F81BD" w:themeColor="accent1"/>
-      <w:sz w:val="22"/>
     </w:rPr>
   </w:style>
   <w:style w:type="paragraph" w:styleId="Heading4">
@@ -2540,11 +1324,11 @@
       <w:contextualSpacing/>
     </w:pPr>
     <w:rPr>
-      <w:rFonts w:asciiTheme="majorHAnsi" w:eastAsiaTheme="majorEastAsia" w:hAnsiTheme="majorHAnsi" w:cstheme="majorBidi" w:ascii="Aptos" w:hAnsi="Aptos"/>
+      <w:rFonts w:asciiTheme="majorHAnsi" w:eastAsiaTheme="majorEastAsia" w:hAnsiTheme="majorHAnsi" w:cstheme="majorBidi"/>
       <w:color w:val="17365D" w:themeColor="text2" w:themeShade="BF"/>
       <w:spacing w:val="5"/>
       <w:kern w:val="28"/>
-      <w:sz w:val="48"/>
+      <w:sz w:val="52"/>
       <w:szCs w:val="52"/>
     </w:rPr>
   </w:style>

</xml_diff>